<commit_message>
Refresh the Elite Cleaning cleaner agreement master from the latest Word file.
Co-authored-by: Cursor <cursoragent@cursor.com>
</commit_message>
<xml_diff>
--- a/data/marketing-manager/Elite_Cleaning_Cleaner_Agreement.docx
+++ b/data/marketing-manager/Elite_Cleaning_Cleaner_Agreement.docx
@@ -21,66 +21,7 @@
         <w:pStyle w:val="Heading1"/>
       </w:pPr>
       <w:r>
-        <w:t>Payment</w:t>
-      </w:r>
-    </w:p>
-    <w:p>
-      <w:pPr>
-        <w:pStyle w:val="ListParagraph"/>
-        <w:numPr>
-          <w:ilvl w:val="0"/>
-          <w:numId w:val="11"/>
-        </w:numPr>
-      </w:pPr>
-      <w:r>
-        <w:t>Cleaners will be paid according to the agreed rate for each completed job.</w:t>
-      </w:r>
-    </w:p>
-    <w:p>
-      <w:pPr>
-        <w:pStyle w:val="ListParagraph"/>
-        <w:numPr>
-          <w:ilvl w:val="0"/>
-          <w:numId w:val="10"/>
-        </w:numPr>
-      </w:pPr>
-      <w:r>
-        <w:t>Payroll is run each Friday</w:t>
-      </w:r>
-      <w:r>
-        <w:t xml:space="preserve"> via ACH to bank. </w:t>
-      </w:r>
-      <w:r>
-        <w:t xml:space="preserve"> Federal Taxes will be processed on each pay run. At the end of the year you will be produced a W2 </w:t>
-      </w:r>
-      <w:r>
-        <w:t xml:space="preserve">to show your pay and taxes. </w:t>
-      </w:r>
-      <w:r>
-        <w:t xml:space="preserve"> We also pay For Workers compensation insurance on payroll. </w:t>
-      </w:r>
-    </w:p>
-    <w:p>
-      <w:pPr>
-        <w:pStyle w:val="ListParagraph"/>
-        <w:numPr>
-          <w:ilvl w:val="0"/>
-          <w:numId w:val="11"/>
-        </w:numPr>
-      </w:pPr>
-      <w:r>
-        <w:t>Any tips given directly by customers belong entirely to the Cleaner and will not reduce or affect their agreed pay.</w:t>
-      </w:r>
-    </w:p>
-    <w:p>
-      <w:pPr>
-        <w:pStyle w:val="Heading1"/>
-      </w:pPr>
-      <w:r>
-        <w:t>P</w:t>
-      </w:r>
-      <w:r>
-        <w:t>rofessional Standards</w:t>
+        <w:t>Professional Standards</w:t>
       </w:r>
     </w:p>
     <w:p>
@@ -148,15 +89,74 @@
         <w:pStyle w:val="Heading1"/>
       </w:pPr>
       <w:r>
-        <w:t>C</w:t>
+        <w:t>Payment</w:t>
+      </w:r>
+    </w:p>
+    <w:p>
+      <w:pPr>
+        <w:pStyle w:val="ListParagraph"/>
+        <w:numPr>
+          <w:ilvl w:val="0"/>
+          <w:numId w:val="11"/>
+        </w:numPr>
+      </w:pPr>
+      <w:r>
+        <w:t>Cleaners will be paid according to the agreed rate for each completed job.</w:t>
+      </w:r>
+    </w:p>
+    <w:p>
+      <w:pPr>
+        <w:pStyle w:val="ListParagraph"/>
+        <w:numPr>
+          <w:ilvl w:val="0"/>
+          <w:numId w:val="11"/>
+        </w:numPr>
+      </w:pPr>
+      <w:r>
+        <w:t>Payroll is run each Friday</w:t>
       </w:r>
       <w:r>
-        <w:t>onfidential Information</w:t>
+        <w:t xml:space="preserve"> via ACH to bank. </w:t>
+      </w:r>
+      <w:r>
+        <w:t xml:space="preserve"> Federal Taxes will be processed on each pay run. At the end of the year you will be produced a W2 </w:t>
+      </w:r>
+      <w:r>
+        <w:t xml:space="preserve">to show your pay and taxes. </w:t>
+      </w:r>
+      <w:r>
+        <w:t xml:space="preserve"> </w:t>
+      </w:r>
+    </w:p>
+    <w:p>
+      <w:pPr>
+        <w:pStyle w:val="ListParagraph"/>
+        <w:numPr>
+          <w:ilvl w:val="0"/>
+          <w:numId w:val="11"/>
+        </w:numPr>
+      </w:pPr>
+      <w:r>
+        <w:t>Any tips given directly by customers belong entirely to the Cleaner and will not reduce or affect their agreed pay.</w:t>
+      </w:r>
+    </w:p>
+    <w:p>
+      <w:pPr>
+        <w:pStyle w:val="Heading1"/>
+      </w:pPr>
+      <w:r>
+        <w:t>Confidential Information</w:t>
       </w:r>
     </w:p>
     <w:p>
       <w:r>
-        <w:t>Customer information including names, addresses, phone numbers, alarm codes, pricing and schedules is confidential.</w:t>
+        <w:t xml:space="preserve">Customer </w:t>
+      </w:r>
+      <w:r>
+        <w:t>information,</w:t>
+      </w:r>
+      <w:r>
+        <w:t xml:space="preserve"> including names, addresses, phone numbers, alarm codes, pricing and schedules is confidential.</w:t>
       </w:r>
     </w:p>
     <w:p>
@@ -214,6 +214,9 @@
       </w:r>
       <w:r>
         <w:t xml:space="preserve"> for a period of 12 months.</w:t>
+      </w:r>
+      <w:r>
+        <w:t xml:space="preserve">  </w:t>
       </w:r>
     </w:p>
     <w:p>

</xml_diff>